<commit_message>
Testien polut ja mbstring-laajennus korjattu, testit ajettu onnistuneesti
</commit_message>
<xml_diff>
--- a/Enneagrammikitestikehitys.docx
+++ b/Enneagrammikitestikehitys.docx
@@ -164,6 +164,7 @@
           <w:bCs/>
           <w:sz w:val="24"/>
           <w:szCs w:val="24"/>
+          <w:lang w:val="en-US"/>
         </w:rPr>
       </w:pPr>
       <w:proofErr w:type="spellStart"/>
@@ -173,6 +174,7 @@
           <w:bCs/>
           <w:sz w:val="24"/>
           <w:szCs w:val="24"/>
+          <w:lang w:val="en-US"/>
         </w:rPr>
         <w:t>php</w:t>
       </w:r>
@@ -183,8 +185,9 @@
           <w:bCs/>
           <w:sz w:val="24"/>
           <w:szCs w:val="24"/>
-        </w:rPr>
-        <w:t xml:space="preserve"> </w:t>
+          <w:lang w:val="en-US"/>
+        </w:rPr>
+        <w:t xml:space="preserve"> tests\</w:t>
       </w:r>
       <w:proofErr w:type="spellStart"/>
       <w:r>
@@ -193,30 +196,117 @@
           <w:bCs/>
           <w:sz w:val="24"/>
           <w:szCs w:val="24"/>
-        </w:rPr>
-        <w:t>tests</w:t>
-      </w:r>
-      <w:proofErr w:type="spellEnd"/>
-      <w:r>
-        <w:rPr>
-          <w:b/>
-          <w:bCs/>
+          <w:lang w:val="en-US"/>
+        </w:rPr>
+        <w:t>tiebreak_tests.php</w:t>
+      </w:r>
+      <w:proofErr w:type="spellEnd"/>
+    </w:p>
+    <w:p>
+      <w:pPr>
+        <w:rPr>
+          <w:b/>
+          <w:bCs/>
+          <w:sz w:val="32"/>
+          <w:szCs w:val="32"/>
+          <w:lang w:val="en-US"/>
+        </w:rPr>
+      </w:pPr>
+    </w:p>
+    <w:p>
+      <w:pPr>
+        <w:rPr>
+          <w:b/>
+          <w:bCs/>
+          <w:sz w:val="32"/>
+          <w:szCs w:val="32"/>
+          <w:lang w:val="en-US"/>
+        </w:rPr>
+      </w:pPr>
+      <w:r>
+        <w:rPr>
+          <w:b/>
+          <w:bCs/>
+          <w:sz w:val="32"/>
+          <w:szCs w:val="32"/>
+          <w:lang w:val="en-US"/>
+        </w:rPr>
+        <w:t>PHP-</w:t>
+      </w:r>
+      <w:proofErr w:type="spellStart"/>
+      <w:r>
+        <w:rPr>
+          <w:b/>
+          <w:bCs/>
+          <w:sz w:val="32"/>
+          <w:szCs w:val="32"/>
+          <w:lang w:val="en-US"/>
+        </w:rPr>
+        <w:t>tason</w:t>
+      </w:r>
+      <w:proofErr w:type="spellEnd"/>
+      <w:r>
+        <w:rPr>
+          <w:b/>
+          <w:bCs/>
+          <w:sz w:val="32"/>
+          <w:szCs w:val="32"/>
+          <w:lang w:val="en-US"/>
+        </w:rPr>
+        <w:t xml:space="preserve"> </w:t>
+      </w:r>
+      <w:proofErr w:type="spellStart"/>
+      <w:r>
+        <w:rPr>
+          <w:b/>
+          <w:bCs/>
+          <w:sz w:val="32"/>
+          <w:szCs w:val="32"/>
+          <w:lang w:val="en-US"/>
+        </w:rPr>
+        <w:t>testi</w:t>
+      </w:r>
+      <w:proofErr w:type="spellEnd"/>
+    </w:p>
+    <w:p>
+      <w:pPr>
+        <w:rPr>
           <w:sz w:val="24"/>
           <w:szCs w:val="24"/>
         </w:rPr>
-        <w:t>\</w:t>
-      </w:r>
-      <w:proofErr w:type="spellStart"/>
-      <w:r>
-        <w:rPr>
-          <w:b/>
-          <w:bCs/>
+      </w:pPr>
+      <w:proofErr w:type="spellStart"/>
+      <w:r>
+        <w:rPr>
           <w:sz w:val="24"/>
           <w:szCs w:val="24"/>
         </w:rPr>
-        <w:t>tiebreak_tests.php</w:t>
-      </w:r>
-      <w:proofErr w:type="spellEnd"/>
+        <w:t>php</w:t>
+      </w:r>
+      <w:proofErr w:type="spellEnd"/>
+      <w:r>
+        <w:rPr>
+          <w:sz w:val="24"/>
+          <w:szCs w:val="24"/>
+        </w:rPr>
+        <w:t xml:space="preserve"> </w:t>
+      </w:r>
+      <w:proofErr w:type="spellStart"/>
+      <w:r>
+        <w:rPr>
+          <w:sz w:val="24"/>
+          <w:szCs w:val="24"/>
+        </w:rPr>
+        <w:t>scripts</w:t>
+      </w:r>
+      <w:proofErr w:type="spellEnd"/>
+      <w:r>
+        <w:rPr>
+          <w:sz w:val="24"/>
+          <w:szCs w:val="24"/>
+        </w:rPr>
+        <w:t>\e2e_test.php</w:t>
+      </w:r>
     </w:p>
     <w:p>
       <w:pPr>
@@ -237,55 +327,16 @@
           <w:szCs w:val="32"/>
         </w:rPr>
       </w:pPr>
-      <w:r>
+    </w:p>
+    <w:p>
+      <w:pPr>
         <w:rPr>
           <w:b/>
           <w:bCs/>
           <w:sz w:val="32"/>
           <w:szCs w:val="32"/>
         </w:rPr>
-        <w:t>PHP-tason testi</w:t>
-      </w:r>
-    </w:p>
-    <w:p>
-      <w:pPr>
-        <w:rPr>
-          <w:sz w:val="24"/>
-          <w:szCs w:val="24"/>
-        </w:rPr>
-      </w:pPr>
-      <w:proofErr w:type="spellStart"/>
-      <w:r>
-        <w:rPr>
-          <w:sz w:val="24"/>
-          <w:szCs w:val="24"/>
-        </w:rPr>
-        <w:t>php</w:t>
-      </w:r>
-      <w:proofErr w:type="spellEnd"/>
-      <w:r>
-        <w:rPr>
-          <w:sz w:val="24"/>
-          <w:szCs w:val="24"/>
-        </w:rPr>
-        <w:t xml:space="preserve"> </w:t>
-      </w:r>
-      <w:proofErr w:type="spellStart"/>
-      <w:r>
-        <w:rPr>
-          <w:sz w:val="24"/>
-          <w:szCs w:val="24"/>
-        </w:rPr>
-        <w:t>scripts</w:t>
-      </w:r>
-      <w:proofErr w:type="spellEnd"/>
-      <w:r>
-        <w:rPr>
-          <w:sz w:val="24"/>
-          <w:szCs w:val="24"/>
-        </w:rPr>
-        <w:t>\e2e_test.php</w:t>
-      </w:r>
+      </w:pPr>
     </w:p>
     <w:p>
       <w:pPr>
@@ -296,37 +347,35 @@
           <w:szCs w:val="32"/>
         </w:rPr>
       </w:pPr>
-    </w:p>
-    <w:p>
-      <w:pPr>
+      <w:proofErr w:type="spellStart"/>
+      <w:r>
         <w:rPr>
           <w:b/>
           <w:bCs/>
           <w:sz w:val="32"/>
           <w:szCs w:val="32"/>
         </w:rPr>
-      </w:pPr>
-    </w:p>
-    <w:p>
-      <w:pPr>
+        <w:t>Enneagrammitest</w:t>
+      </w:r>
+      <w:r>
         <w:rPr>
           <w:b/>
           <w:bCs/>
           <w:sz w:val="32"/>
           <w:szCs w:val="32"/>
         </w:rPr>
-      </w:pPr>
-    </w:p>
-    <w:p>
-      <w:pPr>
+        <w:t>in</w:t>
+      </w:r>
+      <w:proofErr w:type="spellEnd"/>
+      <w:r>
         <w:rPr>
           <w:b/>
           <w:bCs/>
           <w:sz w:val="32"/>
           <w:szCs w:val="32"/>
         </w:rPr>
-      </w:pPr>
-      <w:proofErr w:type="spellStart"/>
+        <w:t xml:space="preserve"> </w:t>
+      </w:r>
       <w:r>
         <w:rPr>
           <w:b/>
@@ -334,7 +383,7 @@
           <w:sz w:val="32"/>
           <w:szCs w:val="32"/>
         </w:rPr>
-        <w:t>Enneagrammitest</w:t>
+        <w:t>kehitys</w:t>
       </w:r>
       <w:r>
         <w:rPr>
@@ -343,34 +392,6 @@
           <w:sz w:val="32"/>
           <w:szCs w:val="32"/>
         </w:rPr>
-        <w:t>in</w:t>
-      </w:r>
-      <w:proofErr w:type="spellEnd"/>
-      <w:r>
-        <w:rPr>
-          <w:b/>
-          <w:bCs/>
-          <w:sz w:val="32"/>
-          <w:szCs w:val="32"/>
-        </w:rPr>
-        <w:t xml:space="preserve"> </w:t>
-      </w:r>
-      <w:r>
-        <w:rPr>
-          <w:b/>
-          <w:bCs/>
-          <w:sz w:val="32"/>
-          <w:szCs w:val="32"/>
-        </w:rPr>
-        <w:t>kehitys</w:t>
-      </w:r>
-      <w:r>
-        <w:rPr>
-          <w:b/>
-          <w:bCs/>
-          <w:sz w:val="32"/>
-          <w:szCs w:val="32"/>
-        </w:rPr>
         <w:t xml:space="preserve"> 2025</w:t>
       </w:r>
     </w:p>
@@ -401,15 +422,7 @@
     <w:p/>
     <w:p>
       <w:r>
-        <w:t xml:space="preserve">Toinen paikka on </w:t>
-      </w:r>
-      <w:proofErr w:type="spellStart"/>
-      <w:r>
-        <w:t>kalle</w:t>
-      </w:r>
-      <w:proofErr w:type="spellEnd"/>
-      <w:r>
-        <w:t xml:space="preserve"> hakemistossa </w:t>
+        <w:t xml:space="preserve">Toinen paikka on kalle hakemistossa </w:t>
       </w:r>
       <w:r>
         <w:t>C:\Users\Kalle\Documents\GitHub\egtesti</w:t>
@@ -567,12 +580,23 @@
       </w:pPr>
     </w:p>
     <w:p>
-      <w:proofErr w:type="spellStart"/>
-      <w:r>
+      <w:pPr>
+        <w:rPr>
+          <w:lang w:val="en-US"/>
+        </w:rPr>
+      </w:pPr>
+      <w:proofErr w:type="spellStart"/>
+      <w:r>
+        <w:rPr>
+          <w:lang w:val="en-US"/>
+        </w:rPr>
         <w:t>php</w:t>
       </w:r>
       <w:proofErr w:type="spellEnd"/>
       <w:r>
+        <w:rPr>
+          <w:lang w:val="en-US"/>
+        </w:rPr>
         <w:t xml:space="preserve"> -S localhost:8000 </w:t>
       </w:r>
     </w:p>
@@ -4423,11 +4447,67 @@
       <w:r>
         <w:t xml:space="preserve"> uuden malliset </w:t>
       </w:r>
-      <w:proofErr w:type="spellStart"/>
-      <w:r>
-        <w:t>kysymyset</w:t>
-      </w:r>
-      <w:proofErr w:type="spellEnd"/>
+      <w:r>
+        <w:t>kysymykset</w:t>
+      </w:r>
+    </w:p>
+    <w:p>
+      <w:pPr>
+        <w:ind w:left="360"/>
+      </w:pPr>
+      <w:r>
+        <w:t>14.10 jatkuu</w:t>
+      </w:r>
+    </w:p>
+    <w:p>
+      <w:pPr>
+        <w:pStyle w:val="Luettelokappale"/>
+        <w:numPr>
+          <w:ilvl w:val="0"/>
+          <w:numId w:val="11"/>
+        </w:numPr>
+      </w:pPr>
+      <w:r>
+        <w:t xml:space="preserve"> Miten saa helpoimmin lokista tiedot </w:t>
+      </w:r>
+      <w:proofErr w:type="gramStart"/>
+      <w:r>
+        <w:t>V1TB</w:t>
+      </w:r>
+      <w:proofErr w:type="gramEnd"/>
+      <w:r>
+        <w:t xml:space="preserve"> kun on kysytty </w:t>
+      </w:r>
+      <w:proofErr w:type="gramStart"/>
+      <w:r>
+        <w:t>sama  kysymys</w:t>
+      </w:r>
+      <w:proofErr w:type="gramEnd"/>
+      <w:r>
+        <w:t xml:space="preserve"> uudestaan?</w:t>
+      </w:r>
+    </w:p>
+    <w:p>
+      <w:pPr>
+        <w:pStyle w:val="Luettelokappale"/>
+        <w:numPr>
+          <w:ilvl w:val="0"/>
+          <w:numId w:val="11"/>
+        </w:numPr>
+      </w:pPr>
+    </w:p>
+    <w:p>
+      <w:pPr>
+        <w:pStyle w:val="Luettelokappale"/>
+      </w:pPr>
+      <w:r>
+        <w:t>49.</w:t>
+      </w:r>
+    </w:p>
+    <w:p>
+      <w:pPr>
+        <w:pStyle w:val="Luettelokappale"/>
+      </w:pPr>
     </w:p>
     <w:p>
       <w:pPr>
@@ -6544,6 +6624,7 @@
   <w:style w:type="character" w:default="1" w:styleId="Kappaleenoletusfontti">
     <w:name w:val="Default Paragraph Font"/>
     <w:uiPriority w:val="1"/>
+    <w:semiHidden/>
     <w:unhideWhenUsed/>
   </w:style>
   <w:style w:type="table" w:default="1" w:styleId="Normaalitaulukko">

</xml_diff>